<commit_message>
Added APA reference to persona image
</commit_message>
<xml_diff>
--- a/persona templates/Persona Olivia.docx
+++ b/persona templates/Persona Olivia.docx
@@ -3,6 +3,172 @@
 <w:document xmlns:wpc="http://schemas.microsoft.com/office/word/2010/wordprocessingCanvas" xmlns:cx="http://schemas.microsoft.com/office/drawing/2014/chartex" xmlns:cx1="http://schemas.microsoft.com/office/drawing/2015/9/8/chartex" xmlns:cx2="http://schemas.microsoft.com/office/drawing/2015/10/21/chartex" xmlns:cx3="http://schemas.microsoft.com/office/drawing/2016/5/9/chartex" xmlns:cx4="http://schemas.microsoft.com/office/drawing/2016/5/10/chartex" xmlns:cx5="http://schemas.microsoft.com/office/drawing/2016/5/11/chartex" xmlns:cx6="http://schemas.microsoft.com/office/drawing/2016/5/12/chartex" xmlns:cx7="http://schemas.microsoft.com/office/drawing/2016/5/13/chartex" xmlns:cx8="http://schemas.microsoft.com/office/drawing/2016/5/14/chartex" xmlns:mc="http://schemas.openxmlformats.org/markup-compatibility/2006" xmlns:aink="http://schemas.microsoft.com/office/drawing/2016/ink" xmlns:am3d="http://schemas.microsoft.com/office/drawing/2017/model3d" xmlns:o="urn:schemas-microsoft-com:office:office" xmlns:oel="http://schemas.microsoft.com/office/2019/extlst" xmlns:r="http://schemas.openxmlformats.org/officeDocument/2006/relationships" xmlns:m="http://schemas.openxmlformats.org/officeDocument/2006/math" xmlns:v="urn:schemas-microsoft-com:vml" xmlns:wp14="http://schemas.microsoft.com/office/word/2010/wordprocessingDrawing" xmlns:wp="http://schemas.openxmlformats.org/drawingml/2006/wordprocessingDrawing" xmlns:w10="urn:schemas-microsoft-com:office:word" xmlns:w="http://schemas.openxmlformats.org/wordprocessingml/2006/main" xmlns:w14="http://schemas.microsoft.com/office/word/2010/wordml" xmlns:w15="http://schemas.microsoft.com/office/word/2012/wordml" xmlns:w16cex="http://schemas.microsoft.com/office/word/2018/wordml/cex" xmlns:w16cid="http://schemas.microsoft.com/office/word/2016/wordml/cid" xmlns:w16="http://schemas.microsoft.com/office/word/2018/wordml" xmlns:w16du="http://schemas.microsoft.com/office/word/2023/wordml/word16du" xmlns:w16sdtdh="http://schemas.microsoft.com/office/word/2020/wordml/sdtdatahash" xmlns:w16sdtfl="http://schemas.microsoft.com/office/word/2024/wordml/sdtformatlock" xmlns:w16se="http://schemas.microsoft.com/office/word/2015/wordml/symex" xmlns:wpg="http://schemas.microsoft.com/office/word/2010/wordprocessingGroup" xmlns:wpi="http://schemas.microsoft.com/office/word/2010/wordprocessingInk" xmlns:wne="http://schemas.microsoft.com/office/word/2006/wordml" xmlns:wps="http://schemas.microsoft.com/office/word/2010/wordprocessingShape" mc:Ignorable="w14 w15 w16se w16cid w16 w16cex w16sdtdh w16sdtfl w16du wp14">
   <w:body>
     <w:p>
+      <w:r>
+        <w:rPr>
+          <w:noProof/>
+        </w:rPr>
+        <mc:AlternateContent>
+          <mc:Choice Requires="wps">
+            <w:drawing>
+              <wp:anchor distT="0" distB="0" distL="114300" distR="114300" simplePos="0" relativeHeight="251659264" behindDoc="0" locked="0" layoutInCell="1" allowOverlap="1" wp14:anchorId="363E6762" wp14:editId="3F032190">
+                <wp:simplePos x="0" y="0"/>
+                <wp:positionH relativeFrom="margin">
+                  <wp:posOffset>641333</wp:posOffset>
+                </wp:positionH>
+                <wp:positionV relativeFrom="paragraph">
+                  <wp:posOffset>2697620</wp:posOffset>
+                </wp:positionV>
+                <wp:extent cx="1612541" cy="363338"/>
+                <wp:effectExtent l="0" t="0" r="0" b="0"/>
+                <wp:wrapNone/>
+                <wp:docPr id="1991314499" name="Text Box 1"/>
+                <wp:cNvGraphicFramePr/>
+                <a:graphic xmlns:a="http://schemas.openxmlformats.org/drawingml/2006/main">
+                  <a:graphicData uri="http://schemas.microsoft.com/office/word/2010/wordprocessingShape">
+                    <wps:wsp>
+                      <wps:cNvSpPr txBox="1"/>
+                      <wps:spPr>
+                        <a:xfrm>
+                          <a:off x="0" y="0"/>
+                          <a:ext cx="1612541" cy="363338"/>
+                        </a:xfrm>
+                        <a:prstGeom prst="rect">
+                          <a:avLst/>
+                        </a:prstGeom>
+                        <a:noFill/>
+                        <a:ln w="6350">
+                          <a:noFill/>
+                        </a:ln>
+                      </wps:spPr>
+                      <wps:txbx>
+                        <w:txbxContent>
+                          <w:p>
+                            <w:pPr>
+                              <w:rPr>
+                                <w:sz w:val="6"/>
+                                <w:szCs w:val="6"/>
+                              </w:rPr>
+                            </w:pPr>
+                            <w:r>
+                              <w:rPr>
+                                <w:sz w:val="6"/>
+                                <w:szCs w:val="6"/>
+                                <w:lang w:val="en-NZ"/>
+                              </w:rPr>
+                              <w:t xml:space="preserve">OpenAI. (2026). </w:t>
+                            </w:r>
+                            <w:r>
+                              <w:rPr>
+                                <w:i/>
+                                <w:iCs/>
+                                <w:sz w:val="6"/>
+                                <w:szCs w:val="6"/>
+                                <w:lang w:val="en-NZ"/>
+                              </w:rPr>
+                              <w:t>AI-generated persona image created using ChatGPT</w:t>
+                            </w:r>
+                            <w:r>
+                              <w:rPr>
+                                <w:sz w:val="6"/>
+                                <w:szCs w:val="6"/>
+                                <w:lang w:val="en-NZ"/>
+                              </w:rPr>
+                              <w:t xml:space="preserve"> [AI-generated image]. </w:t>
+                            </w:r>
+                            <w:hyperlink r:id="rId11" w:tgtFrame="_new" w:history="1">
+                              <w:r>
+                                <w:rPr>
+                                  <w:rStyle w:val="Hyperlink"/>
+                                  <w:sz w:val="6"/>
+                                  <w:szCs w:val="6"/>
+                                  <w:lang w:val="en-NZ"/>
+                                </w:rPr>
+                                <w:t>https://chat.openai.com/</w:t>
+                              </w:r>
+                            </w:hyperlink>
+                          </w:p>
+                        </w:txbxContent>
+                      </wps:txbx>
+                      <wps:bodyPr rot="0" spcFirstLastPara="0" vertOverflow="overflow" horzOverflow="overflow" vert="horz" wrap="square" lIns="91440" tIns="45720" rIns="91440" bIns="45720" numCol="1" spcCol="0" rtlCol="0" fromWordArt="0" anchor="t" anchorCtr="0" forceAA="0" compatLnSpc="1">
+                        <a:prstTxWarp prst="textNoShape">
+                          <a:avLst/>
+                        </a:prstTxWarp>
+                        <a:noAutofit/>
+                      </wps:bodyPr>
+                    </wps:wsp>
+                  </a:graphicData>
+                </a:graphic>
+                <wp14:sizeRelH relativeFrom="margin">
+                  <wp14:pctWidth>0</wp14:pctWidth>
+                </wp14:sizeRelH>
+                <wp14:sizeRelV relativeFrom="margin">
+                  <wp14:pctHeight>0</wp14:pctHeight>
+                </wp14:sizeRelV>
+              </wp:anchor>
+            </w:drawing>
+          </mc:Choice>
+          <mc:Fallback>
+            <w:pict>
+              <v:shapetype w14:anchorId="363E6762" id="_x0000_t202" coordsize="21600,21600" o:spt="202" path="m,l,21600r21600,l21600,xe">
+                <v:stroke joinstyle="miter"/>
+                <v:path gradientshapeok="t" o:connecttype="rect"/>
+              </v:shapetype>
+              <v:shape id="Text Box 1" o:spid="_x0000_s1026" type="#_x0000_t202" style="position:absolute;margin-left:50.5pt;margin-top:212.4pt;width:126.95pt;height:28.6pt;z-index:251659264;visibility:visible;mso-wrap-style:square;mso-width-percent:0;mso-height-percent:0;mso-wrap-distance-left:9pt;mso-wrap-distance-top:0;mso-wrap-distance-right:9pt;mso-wrap-distance-bottom:0;mso-position-horizontal:absolute;mso-position-horizontal-relative:margin;mso-position-vertical:absolute;mso-position-vertical-relative:text;mso-width-percent:0;mso-height-percent:0;mso-width-relative:margin;mso-height-relative:margin;v-text-anchor:top" o:gfxdata="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" filled="f" stroked="f" strokeweight=".5pt">
+                <v:textbox>
+                  <w:txbxContent>
+                    <w:p>
+                      <w:pPr>
+                        <w:rPr>
+                          <w:sz w:val="6"/>
+                          <w:szCs w:val="6"/>
+                        </w:rPr>
+                      </w:pPr>
+                      <w:r>
+                        <w:rPr>
+                          <w:sz w:val="6"/>
+                          <w:szCs w:val="6"/>
+                          <w:lang w:val="en-NZ"/>
+                        </w:rPr>
+                        <w:t xml:space="preserve">OpenAI. (2026). </w:t>
+                      </w:r>
+                      <w:r>
+                        <w:rPr>
+                          <w:i/>
+                          <w:iCs/>
+                          <w:sz w:val="6"/>
+                          <w:szCs w:val="6"/>
+                          <w:lang w:val="en-NZ"/>
+                        </w:rPr>
+                        <w:t>AI-generated persona image created using ChatGPT</w:t>
+                      </w:r>
+                      <w:r>
+                        <w:rPr>
+                          <w:sz w:val="6"/>
+                          <w:szCs w:val="6"/>
+                          <w:lang w:val="en-NZ"/>
+                        </w:rPr>
+                        <w:t xml:space="preserve"> [AI-generated image]. </w:t>
+                      </w:r>
+                      <w:hyperlink r:id="rId12" w:tgtFrame="_new" w:history="1">
+                        <w:r>
+                          <w:rPr>
+                            <w:rStyle w:val="Hyperlink"/>
+                            <w:sz w:val="6"/>
+                            <w:szCs w:val="6"/>
+                            <w:lang w:val="en-NZ"/>
+                          </w:rPr>
+                          <w:t>https://chat.openai.com/</w:t>
+                        </w:r>
+                      </w:hyperlink>
+                    </w:p>
+                  </w:txbxContent>
+                </v:textbox>
+                <w10:wrap anchorx="margin"/>
+              </v:shape>
+            </w:pict>
+          </mc:Fallback>
+        </mc:AlternateContent>
+      </w:r>
       <w:r>
         <w:rPr>
           <w:noProof/>
@@ -23,7 +189,7 @@
                     <pic:cNvPicPr/>
                   </pic:nvPicPr>
                   <pic:blipFill>
-                    <a:blip r:embed="rId11" cstate="print">
+                    <a:blip r:embed="rId13" cstate="print">
                       <a:extLst>
                         <a:ext uri="{28A0092B-C50C-407E-A947-70E740481C1C}">
                           <a14:useLocalDpi xmlns:a14="http://schemas.microsoft.com/office/drawing/2010/main" val="0"/>
@@ -51,12 +217,12 @@
       </w:r>
     </w:p>
     <w:sectPr>
-      <w:headerReference w:type="even" r:id="rId12"/>
-      <w:headerReference w:type="default" r:id="rId13"/>
-      <w:footerReference w:type="even" r:id="rId14"/>
-      <w:footerReference w:type="default" r:id="rId15"/>
-      <w:headerReference w:type="first" r:id="rId16"/>
-      <w:footerReference w:type="first" r:id="rId17"/>
+      <w:headerReference w:type="even" r:id="rId14"/>
+      <w:headerReference w:type="default" r:id="rId15"/>
+      <w:footerReference w:type="even" r:id="rId16"/>
+      <w:footerReference w:type="default" r:id="rId17"/>
+      <w:headerReference w:type="first" r:id="rId18"/>
+      <w:footerReference w:type="first" r:id="rId19"/>
       <w:pgSz w:w="12240" w:h="15840"/>
       <w:pgMar w:top="720" w:right="720" w:bottom="720" w:left="720" w:header="720" w:footer="720" w:gutter="0"/>
       <w:cols w:space="720"/>
@@ -4454,133 +4620,19 @@
 </file>
 
 <file path=customXml/item1.xml><?xml version="1.0" encoding="utf-8"?>
-<p:properties xmlns:p="http://schemas.microsoft.com/office/2006/metadata/properties" xmlns:xsi="http://www.w3.org/2001/XMLSchema-instance" xmlns:pc="http://schemas.microsoft.com/office/infopath/2007/PartnerControls">
-  <documentManagement>
-    <DirectSourceMarket xmlns="4873beb7-5857-4685-be1f-d57550cc96cc" xsi:nil="true"/>
-    <ApprovalStatus xmlns="4873beb7-5857-4685-be1f-d57550cc96cc">InProgress</ApprovalStatus>
-    <MarketSpecific xmlns="4873beb7-5857-4685-be1f-d57550cc96cc">false</MarketSpecific>
-    <LocComments xmlns="4873beb7-5857-4685-be1f-d57550cc96cc" xsi:nil="true"/>
-    <ThumbnailAssetId xmlns="4873beb7-5857-4685-be1f-d57550cc96cc" xsi:nil="true"/>
-    <PrimaryImageGen xmlns="4873beb7-5857-4685-be1f-d57550cc96cc">true</PrimaryImageGen>
-    <LegacyData xmlns="4873beb7-5857-4685-be1f-d57550cc96cc" xsi:nil="true"/>
-    <LocRecommendedHandoff xmlns="4873beb7-5857-4685-be1f-d57550cc96cc" xsi:nil="true"/>
-    <BusinessGroup xmlns="4873beb7-5857-4685-be1f-d57550cc96cc" xsi:nil="true"/>
-    <BlockPublish xmlns="4873beb7-5857-4685-be1f-d57550cc96cc">false</BlockPublish>
-    <TPFriendlyName xmlns="4873beb7-5857-4685-be1f-d57550cc96cc" xsi:nil="true"/>
-    <NumericId xmlns="4873beb7-5857-4685-be1f-d57550cc96cc" xsi:nil="true"/>
-    <APEditor xmlns="4873beb7-5857-4685-be1f-d57550cc96cc">
-      <UserInfo>
-        <DisplayName/>
-        <AccountId xsi:nil="true"/>
-        <AccountType/>
-      </UserInfo>
-    </APEditor>
-    <SourceTitle xmlns="4873beb7-5857-4685-be1f-d57550cc96cc" xsi:nil="true"/>
-    <OpenTemplate xmlns="4873beb7-5857-4685-be1f-d57550cc96cc">true</OpenTemplate>
-    <UALocComments xmlns="4873beb7-5857-4685-be1f-d57550cc96cc">2007 Template UpLeveling Do Not HandOff</UALocComments>
-    <ParentAssetId xmlns="4873beb7-5857-4685-be1f-d57550cc96cc" xsi:nil="true"/>
-    <IntlLangReviewDate xmlns="4873beb7-5857-4685-be1f-d57550cc96cc" xsi:nil="true"/>
-    <FeatureTagsTaxHTField0 xmlns="4873beb7-5857-4685-be1f-d57550cc96cc">
-      <Terms xmlns="http://schemas.microsoft.com/office/infopath/2007/PartnerControls"/>
-    </FeatureTagsTaxHTField0>
-    <PublishStatusLookup xmlns="4873beb7-5857-4685-be1f-d57550cc96cc">
-      <Value>1370089</Value>
-      <Value>1531210</Value>
-    </PublishStatusLookup>
-    <Providers xmlns="4873beb7-5857-4685-be1f-d57550cc96cc" xsi:nil="true"/>
-    <MachineTranslated xmlns="4873beb7-5857-4685-be1f-d57550cc96cc">false</MachineTranslated>
-    <OriginalSourceMarket xmlns="4873beb7-5857-4685-be1f-d57550cc96cc" xsi:nil="true"/>
-    <APDescription xmlns="4873beb7-5857-4685-be1f-d57550cc96cc" xsi:nil="true"/>
-    <ClipArtFilename xmlns="4873beb7-5857-4685-be1f-d57550cc96cc" xsi:nil="true"/>
-    <ContentItem xmlns="4873beb7-5857-4685-be1f-d57550cc96cc" xsi:nil="true"/>
-    <TPInstallLocation xmlns="4873beb7-5857-4685-be1f-d57550cc96cc" xsi:nil="true"/>
-    <PublishTargets xmlns="4873beb7-5857-4685-be1f-d57550cc96cc">OfficeOnline,OfficeOnlineVNext</PublishTargets>
-    <TimesCloned xmlns="4873beb7-5857-4685-be1f-d57550cc96cc" xsi:nil="true"/>
-    <AssetStart xmlns="4873beb7-5857-4685-be1f-d57550cc96cc">2011-12-15T21:13:00+00:00</AssetStart>
-    <Provider xmlns="4873beb7-5857-4685-be1f-d57550cc96cc" xsi:nil="true"/>
-    <AcquiredFrom xmlns="4873beb7-5857-4685-be1f-d57550cc96cc">Internal MS</AcquiredFrom>
-    <FriendlyTitle xmlns="4873beb7-5857-4685-be1f-d57550cc96cc" xsi:nil="true"/>
-    <LastHandOff xmlns="4873beb7-5857-4685-be1f-d57550cc96cc" xsi:nil="true"/>
-    <TPClientViewer xmlns="4873beb7-5857-4685-be1f-d57550cc96cc" xsi:nil="true"/>
-    <ShowIn xmlns="4873beb7-5857-4685-be1f-d57550cc96cc">Show everywhere</ShowIn>
-    <UANotes xmlns="4873beb7-5857-4685-be1f-d57550cc96cc" xsi:nil="true"/>
-    <TemplateStatus xmlns="4873beb7-5857-4685-be1f-d57550cc96cc">Complete</TemplateStatus>
-    <InternalTagsTaxHTField0 xmlns="4873beb7-5857-4685-be1f-d57550cc96cc">
-      <Terms xmlns="http://schemas.microsoft.com/office/infopath/2007/PartnerControls"/>
-    </InternalTagsTaxHTField0>
-    <CSXHash xmlns="4873beb7-5857-4685-be1f-d57550cc96cc" xsi:nil="true"/>
-    <Downloads xmlns="4873beb7-5857-4685-be1f-d57550cc96cc">0</Downloads>
-    <VoteCount xmlns="4873beb7-5857-4685-be1f-d57550cc96cc" xsi:nil="true"/>
-    <OOCacheId xmlns="4873beb7-5857-4685-be1f-d57550cc96cc" xsi:nil="true"/>
-    <IsDeleted xmlns="4873beb7-5857-4685-be1f-d57550cc96cc">false</IsDeleted>
-    <AssetExpire xmlns="4873beb7-5857-4685-be1f-d57550cc96cc">2035-01-01T08:00:00+00:00</AssetExpire>
-    <DSATActionTaken xmlns="4873beb7-5857-4685-be1f-d57550cc96cc" xsi:nil="true"/>
-    <CSXSubmissionMarket xmlns="4873beb7-5857-4685-be1f-d57550cc96cc" xsi:nil="true"/>
-    <TPExecutable xmlns="4873beb7-5857-4685-be1f-d57550cc96cc" xsi:nil="true"/>
-    <SubmitterId xmlns="4873beb7-5857-4685-be1f-d57550cc96cc" xsi:nil="true"/>
-    <EditorialTags xmlns="4873beb7-5857-4685-be1f-d57550cc96cc" xsi:nil="true"/>
-    <ApprovalLog xmlns="4873beb7-5857-4685-be1f-d57550cc96cc" xsi:nil="true"/>
-    <AssetType xmlns="4873beb7-5857-4685-be1f-d57550cc96cc">TP</AssetType>
-    <BugNumber xmlns="4873beb7-5857-4685-be1f-d57550cc96cc" xsi:nil="true"/>
-    <CSXSubmissionDate xmlns="4873beb7-5857-4685-be1f-d57550cc96cc" xsi:nil="true"/>
-    <CSXUpdate xmlns="4873beb7-5857-4685-be1f-d57550cc96cc">false</CSXUpdate>
-    <Milestone xmlns="4873beb7-5857-4685-be1f-d57550cc96cc" xsi:nil="true"/>
-    <RecommendationsModifier xmlns="4873beb7-5857-4685-be1f-d57550cc96cc" xsi:nil="true"/>
-    <OriginAsset xmlns="4873beb7-5857-4685-be1f-d57550cc96cc" xsi:nil="true"/>
-    <TPComponent xmlns="4873beb7-5857-4685-be1f-d57550cc96cc" xsi:nil="true"/>
-    <AssetId xmlns="4873beb7-5857-4685-be1f-d57550cc96cc">TP102802872</AssetId>
-    <IntlLocPriority xmlns="4873beb7-5857-4685-be1f-d57550cc96cc" xsi:nil="true"/>
-    <PolicheckWords xmlns="4873beb7-5857-4685-be1f-d57550cc96cc" xsi:nil="true"/>
-    <TPLaunchHelpLink xmlns="4873beb7-5857-4685-be1f-d57550cc96cc" xsi:nil="true"/>
-    <TPApplication xmlns="4873beb7-5857-4685-be1f-d57550cc96cc" xsi:nil="true"/>
-    <CrawlForDependencies xmlns="4873beb7-5857-4685-be1f-d57550cc96cc">false</CrawlForDependencies>
-    <HandoffToMSDN xmlns="4873beb7-5857-4685-be1f-d57550cc96cc" xsi:nil="true"/>
-    <PlannedPubDate xmlns="4873beb7-5857-4685-be1f-d57550cc96cc" xsi:nil="true"/>
-    <IntlLangReviewer xmlns="4873beb7-5857-4685-be1f-d57550cc96cc" xsi:nil="true"/>
-    <TrustLevel xmlns="4873beb7-5857-4685-be1f-d57550cc96cc">1 Microsoft Managed Content</TrustLevel>
-    <LocLastLocAttemptVersionLookup xmlns="4873beb7-5857-4685-be1f-d57550cc96cc">715235</LocLastLocAttemptVersionLookup>
-    <IsSearchable xmlns="4873beb7-5857-4685-be1f-d57550cc96cc">true</IsSearchable>
-    <TemplateTemplateType xmlns="4873beb7-5857-4685-be1f-d57550cc96cc">Word 2007 Default</TemplateTemplateType>
-    <CampaignTagsTaxHTField0 xmlns="4873beb7-5857-4685-be1f-d57550cc96cc">
-      <Terms xmlns="http://schemas.microsoft.com/office/infopath/2007/PartnerControls"/>
-    </CampaignTagsTaxHTField0>
-    <TPNamespace xmlns="4873beb7-5857-4685-be1f-d57550cc96cc" xsi:nil="true"/>
-    <TaxCatchAll xmlns="4873beb7-5857-4685-be1f-d57550cc96cc"/>
-    <Markets xmlns="4873beb7-5857-4685-be1f-d57550cc96cc"/>
-    <UAProjectedTotalWords xmlns="4873beb7-5857-4685-be1f-d57550cc96cc" xsi:nil="true"/>
-    <IntlLangReview xmlns="4873beb7-5857-4685-be1f-d57550cc96cc">false</IntlLangReview>
-    <OutputCachingOn xmlns="4873beb7-5857-4685-be1f-d57550cc96cc">false</OutputCachingOn>
-    <AverageRating xmlns="4873beb7-5857-4685-be1f-d57550cc96cc" xsi:nil="true"/>
-    <APAuthor xmlns="4873beb7-5857-4685-be1f-d57550cc96cc">
-      <UserInfo>
-        <DisplayName>REDMOND\v-gakel</DisplayName>
-        <AccountId>2721</AccountId>
-        <AccountType/>
-      </UserInfo>
-    </APAuthor>
-    <LocManualTestRequired xmlns="4873beb7-5857-4685-be1f-d57550cc96cc">false</LocManualTestRequired>
-    <TPCommandLine xmlns="4873beb7-5857-4685-be1f-d57550cc96cc" xsi:nil="true"/>
-    <TPAppVersion xmlns="4873beb7-5857-4685-be1f-d57550cc96cc" xsi:nil="true"/>
-    <EditorialStatus xmlns="4873beb7-5857-4685-be1f-d57550cc96cc" xsi:nil="true"/>
-    <LastModifiedDateTime xmlns="4873beb7-5857-4685-be1f-d57550cc96cc" xsi:nil="true"/>
-    <ScenarioTagsTaxHTField0 xmlns="4873beb7-5857-4685-be1f-d57550cc96cc">
-      <Terms xmlns="http://schemas.microsoft.com/office/infopath/2007/PartnerControls"/>
-    </ScenarioTagsTaxHTField0>
-    <OriginalRelease xmlns="4873beb7-5857-4685-be1f-d57550cc96cc">14</OriginalRelease>
-    <TPLaunchHelpLinkType xmlns="4873beb7-5857-4685-be1f-d57550cc96cc">Template</TPLaunchHelpLinkType>
-    <LocalizationTagsTaxHTField0 xmlns="4873beb7-5857-4685-be1f-d57550cc96cc">
-      <Terms xmlns="http://schemas.microsoft.com/office/infopath/2007/PartnerControls"/>
-    </LocalizationTagsTaxHTField0>
-    <UACurrentWords xmlns="4873beb7-5857-4685-be1f-d57550cc96cc" xsi:nil="true"/>
-    <ArtSampleDocs xmlns="4873beb7-5857-4685-be1f-d57550cc96cc" xsi:nil="true"/>
-    <UALocRecommendation xmlns="4873beb7-5857-4685-be1f-d57550cc96cc">Localize</UALocRecommendation>
-    <Manager xmlns="4873beb7-5857-4685-be1f-d57550cc96cc" xsi:nil="true"/>
-    <LocMarketGroupTiers2 xmlns="4873beb7-5857-4685-be1f-d57550cc96cc">,t:Tier 1,t:Tier 2,t:Tier 3,</LocMarketGroupTiers2>
-  </documentManagement>
-</p:properties>
+<?mso-contentType ?>
+<FormTemplates xmlns="http://schemas.microsoft.com/sharepoint/v3/contenttype/forms">
+  <Display>DocumentLibraryForm</Display>
+  <Edit>AssetEditForm</Edit>
+  <New>DocumentLibraryForm</New>
+</FormTemplates>
 </file>
 
 <file path=customXml/item2.xml><?xml version="1.0" encoding="utf-8"?>
+<b:Sources xmlns:b="http://schemas.openxmlformats.org/officeDocument/2006/bibliography" xmlns="http://schemas.openxmlformats.org/officeDocument/2006/bibliography" SelectedStyle="/APASixthEditionOfficeOnline.xsl" StyleName="APA" Version="6"/>
+</file>
+
+<file path=customXml/item3.xml><?xml version="1.0" encoding="utf-8"?>
 <ct:contentTypeSchema xmlns:ct="http://schemas.microsoft.com/office/2006/metadata/contentType" xmlns:ma="http://schemas.microsoft.com/office/2006/metadata/properties/metaAttributes" ct:_="" ma:_="" ma:contentTypeName="TemplateFile" ma:contentTypeID="0x0101006EDDDB5EE6D98C44930B742096920B300400F5B6D36B3EF94B4E9A635CDF2A18F5B8" ma:contentTypeVersion="72" ma:contentTypeDescription="Create a new document." ma:contentTypeScope="" ma:versionID="a23e56308344d904b51738559c3d67c9">
   <xsd:schema xmlns:xsd="http://www.w3.org/2001/XMLSchema" xmlns:xs="http://www.w3.org/2001/XMLSchema" xmlns:p="http://schemas.microsoft.com/office/2006/metadata/properties" xmlns:ns2="4873beb7-5857-4685-be1f-d57550cc96cc" targetNamespace="http://schemas.microsoft.com/office/2006/metadata/properties" ma:root="true" ma:fieldsID="cd0908cc4600e77bf5da051303e00c8d" ns2:_="">
     <xsd:import namespace="4873beb7-5857-4685-be1f-d57550cc96cc"/>
@@ -5620,30 +5672,150 @@
 </ct:contentTypeSchema>
 </file>
 
-<file path=customXml/item3.xml><?xml version="1.0" encoding="utf-8"?>
-<b:Sources xmlns:b="http://schemas.openxmlformats.org/officeDocument/2006/bibliography" xmlns="http://schemas.openxmlformats.org/officeDocument/2006/bibliography" SelectedStyle="/APASixthEditionOfficeOnline.xsl" StyleName="APA" Version="6"/>
-</file>
-
 <file path=customXml/item4.xml><?xml version="1.0" encoding="utf-8"?>
-<?mso-contentType ?>
-<FormTemplates xmlns="http://schemas.microsoft.com/sharepoint/v3/contenttype/forms">
-  <Display>DocumentLibraryForm</Display>
-  <Edit>AssetEditForm</Edit>
-  <New>DocumentLibraryForm</New>
-</FormTemplates>
+<p:properties xmlns:p="http://schemas.microsoft.com/office/2006/metadata/properties" xmlns:xsi="http://www.w3.org/2001/XMLSchema-instance" xmlns:pc="http://schemas.microsoft.com/office/infopath/2007/PartnerControls">
+  <documentManagement>
+    <DirectSourceMarket xmlns="4873beb7-5857-4685-be1f-d57550cc96cc" xsi:nil="true"/>
+    <ApprovalStatus xmlns="4873beb7-5857-4685-be1f-d57550cc96cc">InProgress</ApprovalStatus>
+    <MarketSpecific xmlns="4873beb7-5857-4685-be1f-d57550cc96cc">false</MarketSpecific>
+    <LocComments xmlns="4873beb7-5857-4685-be1f-d57550cc96cc" xsi:nil="true"/>
+    <ThumbnailAssetId xmlns="4873beb7-5857-4685-be1f-d57550cc96cc" xsi:nil="true"/>
+    <PrimaryImageGen xmlns="4873beb7-5857-4685-be1f-d57550cc96cc">true</PrimaryImageGen>
+    <LegacyData xmlns="4873beb7-5857-4685-be1f-d57550cc96cc" xsi:nil="true"/>
+    <LocRecommendedHandoff xmlns="4873beb7-5857-4685-be1f-d57550cc96cc" xsi:nil="true"/>
+    <BusinessGroup xmlns="4873beb7-5857-4685-be1f-d57550cc96cc" xsi:nil="true"/>
+    <BlockPublish xmlns="4873beb7-5857-4685-be1f-d57550cc96cc">false</BlockPublish>
+    <TPFriendlyName xmlns="4873beb7-5857-4685-be1f-d57550cc96cc" xsi:nil="true"/>
+    <NumericId xmlns="4873beb7-5857-4685-be1f-d57550cc96cc" xsi:nil="true"/>
+    <APEditor xmlns="4873beb7-5857-4685-be1f-d57550cc96cc">
+      <UserInfo>
+        <DisplayName/>
+        <AccountId xsi:nil="true"/>
+        <AccountType/>
+      </UserInfo>
+    </APEditor>
+    <SourceTitle xmlns="4873beb7-5857-4685-be1f-d57550cc96cc" xsi:nil="true"/>
+    <OpenTemplate xmlns="4873beb7-5857-4685-be1f-d57550cc96cc">true</OpenTemplate>
+    <UALocComments xmlns="4873beb7-5857-4685-be1f-d57550cc96cc">2007 Template UpLeveling Do Not HandOff</UALocComments>
+    <ParentAssetId xmlns="4873beb7-5857-4685-be1f-d57550cc96cc" xsi:nil="true"/>
+    <IntlLangReviewDate xmlns="4873beb7-5857-4685-be1f-d57550cc96cc" xsi:nil="true"/>
+    <FeatureTagsTaxHTField0 xmlns="4873beb7-5857-4685-be1f-d57550cc96cc">
+      <Terms xmlns="http://schemas.microsoft.com/office/infopath/2007/PartnerControls"/>
+    </FeatureTagsTaxHTField0>
+    <PublishStatusLookup xmlns="4873beb7-5857-4685-be1f-d57550cc96cc">
+      <Value>1370089</Value>
+      <Value>1531210</Value>
+    </PublishStatusLookup>
+    <Providers xmlns="4873beb7-5857-4685-be1f-d57550cc96cc" xsi:nil="true"/>
+    <MachineTranslated xmlns="4873beb7-5857-4685-be1f-d57550cc96cc">false</MachineTranslated>
+    <OriginalSourceMarket xmlns="4873beb7-5857-4685-be1f-d57550cc96cc" xsi:nil="true"/>
+    <APDescription xmlns="4873beb7-5857-4685-be1f-d57550cc96cc" xsi:nil="true"/>
+    <ClipArtFilename xmlns="4873beb7-5857-4685-be1f-d57550cc96cc" xsi:nil="true"/>
+    <ContentItem xmlns="4873beb7-5857-4685-be1f-d57550cc96cc" xsi:nil="true"/>
+    <TPInstallLocation xmlns="4873beb7-5857-4685-be1f-d57550cc96cc" xsi:nil="true"/>
+    <PublishTargets xmlns="4873beb7-5857-4685-be1f-d57550cc96cc">OfficeOnline,OfficeOnlineVNext</PublishTargets>
+    <TimesCloned xmlns="4873beb7-5857-4685-be1f-d57550cc96cc" xsi:nil="true"/>
+    <AssetStart xmlns="4873beb7-5857-4685-be1f-d57550cc96cc">2011-12-15T21:13:00+00:00</AssetStart>
+    <Provider xmlns="4873beb7-5857-4685-be1f-d57550cc96cc" xsi:nil="true"/>
+    <AcquiredFrom xmlns="4873beb7-5857-4685-be1f-d57550cc96cc">Internal MS</AcquiredFrom>
+    <FriendlyTitle xmlns="4873beb7-5857-4685-be1f-d57550cc96cc" xsi:nil="true"/>
+    <LastHandOff xmlns="4873beb7-5857-4685-be1f-d57550cc96cc" xsi:nil="true"/>
+    <TPClientViewer xmlns="4873beb7-5857-4685-be1f-d57550cc96cc" xsi:nil="true"/>
+    <ShowIn xmlns="4873beb7-5857-4685-be1f-d57550cc96cc">Show everywhere</ShowIn>
+    <UANotes xmlns="4873beb7-5857-4685-be1f-d57550cc96cc" xsi:nil="true"/>
+    <TemplateStatus xmlns="4873beb7-5857-4685-be1f-d57550cc96cc">Complete</TemplateStatus>
+    <InternalTagsTaxHTField0 xmlns="4873beb7-5857-4685-be1f-d57550cc96cc">
+      <Terms xmlns="http://schemas.microsoft.com/office/infopath/2007/PartnerControls"/>
+    </InternalTagsTaxHTField0>
+    <CSXHash xmlns="4873beb7-5857-4685-be1f-d57550cc96cc" xsi:nil="true"/>
+    <Downloads xmlns="4873beb7-5857-4685-be1f-d57550cc96cc">0</Downloads>
+    <VoteCount xmlns="4873beb7-5857-4685-be1f-d57550cc96cc" xsi:nil="true"/>
+    <OOCacheId xmlns="4873beb7-5857-4685-be1f-d57550cc96cc" xsi:nil="true"/>
+    <IsDeleted xmlns="4873beb7-5857-4685-be1f-d57550cc96cc">false</IsDeleted>
+    <AssetExpire xmlns="4873beb7-5857-4685-be1f-d57550cc96cc">2035-01-01T08:00:00+00:00</AssetExpire>
+    <DSATActionTaken xmlns="4873beb7-5857-4685-be1f-d57550cc96cc" xsi:nil="true"/>
+    <CSXSubmissionMarket xmlns="4873beb7-5857-4685-be1f-d57550cc96cc" xsi:nil="true"/>
+    <TPExecutable xmlns="4873beb7-5857-4685-be1f-d57550cc96cc" xsi:nil="true"/>
+    <SubmitterId xmlns="4873beb7-5857-4685-be1f-d57550cc96cc" xsi:nil="true"/>
+    <EditorialTags xmlns="4873beb7-5857-4685-be1f-d57550cc96cc" xsi:nil="true"/>
+    <ApprovalLog xmlns="4873beb7-5857-4685-be1f-d57550cc96cc" xsi:nil="true"/>
+    <AssetType xmlns="4873beb7-5857-4685-be1f-d57550cc96cc">TP</AssetType>
+    <BugNumber xmlns="4873beb7-5857-4685-be1f-d57550cc96cc" xsi:nil="true"/>
+    <CSXSubmissionDate xmlns="4873beb7-5857-4685-be1f-d57550cc96cc" xsi:nil="true"/>
+    <CSXUpdate xmlns="4873beb7-5857-4685-be1f-d57550cc96cc">false</CSXUpdate>
+    <Milestone xmlns="4873beb7-5857-4685-be1f-d57550cc96cc" xsi:nil="true"/>
+    <RecommendationsModifier xmlns="4873beb7-5857-4685-be1f-d57550cc96cc" xsi:nil="true"/>
+    <OriginAsset xmlns="4873beb7-5857-4685-be1f-d57550cc96cc" xsi:nil="true"/>
+    <TPComponent xmlns="4873beb7-5857-4685-be1f-d57550cc96cc" xsi:nil="true"/>
+    <AssetId xmlns="4873beb7-5857-4685-be1f-d57550cc96cc">TP102802872</AssetId>
+    <IntlLocPriority xmlns="4873beb7-5857-4685-be1f-d57550cc96cc" xsi:nil="true"/>
+    <PolicheckWords xmlns="4873beb7-5857-4685-be1f-d57550cc96cc" xsi:nil="true"/>
+    <TPLaunchHelpLink xmlns="4873beb7-5857-4685-be1f-d57550cc96cc" xsi:nil="true"/>
+    <TPApplication xmlns="4873beb7-5857-4685-be1f-d57550cc96cc" xsi:nil="true"/>
+    <CrawlForDependencies xmlns="4873beb7-5857-4685-be1f-d57550cc96cc">false</CrawlForDependencies>
+    <HandoffToMSDN xmlns="4873beb7-5857-4685-be1f-d57550cc96cc" xsi:nil="true"/>
+    <PlannedPubDate xmlns="4873beb7-5857-4685-be1f-d57550cc96cc" xsi:nil="true"/>
+    <IntlLangReviewer xmlns="4873beb7-5857-4685-be1f-d57550cc96cc" xsi:nil="true"/>
+    <TrustLevel xmlns="4873beb7-5857-4685-be1f-d57550cc96cc">1 Microsoft Managed Content</TrustLevel>
+    <LocLastLocAttemptVersionLookup xmlns="4873beb7-5857-4685-be1f-d57550cc96cc">715235</LocLastLocAttemptVersionLookup>
+    <IsSearchable xmlns="4873beb7-5857-4685-be1f-d57550cc96cc">true</IsSearchable>
+    <TemplateTemplateType xmlns="4873beb7-5857-4685-be1f-d57550cc96cc">Word 2007 Default</TemplateTemplateType>
+    <CampaignTagsTaxHTField0 xmlns="4873beb7-5857-4685-be1f-d57550cc96cc">
+      <Terms xmlns="http://schemas.microsoft.com/office/infopath/2007/PartnerControls"/>
+    </CampaignTagsTaxHTField0>
+    <TPNamespace xmlns="4873beb7-5857-4685-be1f-d57550cc96cc" xsi:nil="true"/>
+    <TaxCatchAll xmlns="4873beb7-5857-4685-be1f-d57550cc96cc"/>
+    <Markets xmlns="4873beb7-5857-4685-be1f-d57550cc96cc"/>
+    <UAProjectedTotalWords xmlns="4873beb7-5857-4685-be1f-d57550cc96cc" xsi:nil="true"/>
+    <IntlLangReview xmlns="4873beb7-5857-4685-be1f-d57550cc96cc">false</IntlLangReview>
+    <OutputCachingOn xmlns="4873beb7-5857-4685-be1f-d57550cc96cc">false</OutputCachingOn>
+    <AverageRating xmlns="4873beb7-5857-4685-be1f-d57550cc96cc" xsi:nil="true"/>
+    <APAuthor xmlns="4873beb7-5857-4685-be1f-d57550cc96cc">
+      <UserInfo>
+        <DisplayName>REDMOND\v-gakel</DisplayName>
+        <AccountId>2721</AccountId>
+        <AccountType/>
+      </UserInfo>
+    </APAuthor>
+    <LocManualTestRequired xmlns="4873beb7-5857-4685-be1f-d57550cc96cc">false</LocManualTestRequired>
+    <TPCommandLine xmlns="4873beb7-5857-4685-be1f-d57550cc96cc" xsi:nil="true"/>
+    <TPAppVersion xmlns="4873beb7-5857-4685-be1f-d57550cc96cc" xsi:nil="true"/>
+    <EditorialStatus xmlns="4873beb7-5857-4685-be1f-d57550cc96cc" xsi:nil="true"/>
+    <LastModifiedDateTime xmlns="4873beb7-5857-4685-be1f-d57550cc96cc" xsi:nil="true"/>
+    <ScenarioTagsTaxHTField0 xmlns="4873beb7-5857-4685-be1f-d57550cc96cc">
+      <Terms xmlns="http://schemas.microsoft.com/office/infopath/2007/PartnerControls"/>
+    </ScenarioTagsTaxHTField0>
+    <OriginalRelease xmlns="4873beb7-5857-4685-be1f-d57550cc96cc">14</OriginalRelease>
+    <TPLaunchHelpLinkType xmlns="4873beb7-5857-4685-be1f-d57550cc96cc">Template</TPLaunchHelpLinkType>
+    <LocalizationTagsTaxHTField0 xmlns="4873beb7-5857-4685-be1f-d57550cc96cc">
+      <Terms xmlns="http://schemas.microsoft.com/office/infopath/2007/PartnerControls"/>
+    </LocalizationTagsTaxHTField0>
+    <UACurrentWords xmlns="4873beb7-5857-4685-be1f-d57550cc96cc" xsi:nil="true"/>
+    <ArtSampleDocs xmlns="4873beb7-5857-4685-be1f-d57550cc96cc" xsi:nil="true"/>
+    <UALocRecommendation xmlns="4873beb7-5857-4685-be1f-d57550cc96cc">Localize</UALocRecommendation>
+    <Manager xmlns="4873beb7-5857-4685-be1f-d57550cc96cc" xsi:nil="true"/>
+    <LocMarketGroupTiers2 xmlns="4873beb7-5857-4685-be1f-d57550cc96cc">,t:Tier 1,t:Tier 2,t:Tier 3,</LocMarketGroupTiers2>
+  </documentManagement>
+</p:properties>
 </file>
 
 <file path=customXml/itemProps1.xml><?xml version="1.0" encoding="utf-8"?>
-<ds:datastoreItem xmlns:ds="http://schemas.openxmlformats.org/officeDocument/2006/customXml" ds:itemID="{CBD348DC-98DA-4004-8F63-30B02DAA0E87}">
+<ds:datastoreItem xmlns:ds="http://schemas.openxmlformats.org/officeDocument/2006/customXml" ds:itemID="{52170F79-8AD9-4618-841D-AB232407957C}">
   <ds:schemaRefs>
-    <ds:schemaRef ds:uri="http://schemas.microsoft.com/office/2006/metadata/properties"/>
-    <ds:schemaRef ds:uri="http://schemas.microsoft.com/office/infopath/2007/PartnerControls"/>
-    <ds:schemaRef ds:uri="4873beb7-5857-4685-be1f-d57550cc96cc"/>
+    <ds:schemaRef ds:uri="http://schemas.microsoft.com/sharepoint/v3/contenttype/forms"/>
   </ds:schemaRefs>
 </ds:datastoreItem>
 </file>
 
 <file path=customXml/itemProps2.xml><?xml version="1.0" encoding="utf-8"?>
+<ds:datastoreItem xmlns:ds="http://schemas.openxmlformats.org/officeDocument/2006/customXml" ds:itemID="{EDB13EB8-44E8-401C-A1E5-6A68E23AEDB2}">
+  <ds:schemaRefs>
+    <ds:schemaRef ds:uri="http://schemas.openxmlformats.org/officeDocument/2006/bibliography"/>
+  </ds:schemaRefs>
+</ds:datastoreItem>
+</file>
+
+<file path=customXml/itemProps3.xml><?xml version="1.0" encoding="utf-8"?>
 <ds:datastoreItem xmlns:ds="http://schemas.openxmlformats.org/officeDocument/2006/customXml" ds:itemID="{9DB327D7-915C-4567-B4AD-E43B816B4266}">
   <ds:schemaRefs>
     <ds:schemaRef ds:uri="http://schemas.microsoft.com/office/2006/metadata/contentType"/>
@@ -5661,18 +5833,12 @@
 </ds:datastoreItem>
 </file>
 
-<file path=customXml/itemProps3.xml><?xml version="1.0" encoding="utf-8"?>
-<ds:datastoreItem xmlns:ds="http://schemas.openxmlformats.org/officeDocument/2006/customXml" ds:itemID="{EDB13EB8-44E8-401C-A1E5-6A68E23AEDB2}">
+<file path=customXml/itemProps4.xml><?xml version="1.0" encoding="utf-8"?>
+<ds:datastoreItem xmlns:ds="http://schemas.openxmlformats.org/officeDocument/2006/customXml" ds:itemID="{CBD348DC-98DA-4004-8F63-30B02DAA0E87}">
   <ds:schemaRefs>
-    <ds:schemaRef ds:uri="http://schemas.openxmlformats.org/officeDocument/2006/bibliography"/>
-  </ds:schemaRefs>
-</ds:datastoreItem>
-</file>
-
-<file path=customXml/itemProps4.xml><?xml version="1.0" encoding="utf-8"?>
-<ds:datastoreItem xmlns:ds="http://schemas.openxmlformats.org/officeDocument/2006/customXml" ds:itemID="{52170F79-8AD9-4618-841D-AB232407957C}">
-  <ds:schemaRefs>
-    <ds:schemaRef ds:uri="http://schemas.microsoft.com/sharepoint/v3/contenttype/forms"/>
+    <ds:schemaRef ds:uri="http://schemas.microsoft.com/office/2006/metadata/properties"/>
+    <ds:schemaRef ds:uri="http://schemas.microsoft.com/office/infopath/2007/PartnerControls"/>
+    <ds:schemaRef ds:uri="4873beb7-5857-4685-be1f-d57550cc96cc"/>
   </ds:schemaRefs>
 </ds:datastoreItem>
 </file>
</xml_diff>